<commit_message>
Final review fixes: clarify salary numbers and update README description
- Explain that 63% is the share of salary explained only by college
  (college on its own explains 89%), in the notebook, README and report.
- Note that the 700 rows are 340 different graduates after cleaning.
- Replace the Hebrew README description, which described a different
  dataset (education levels), with one that matches job_placement.csv.

Co-Authored-By: Claude Opus 5.5 (1M context) <noreply@anthropic.com>
Claude-Session: https://claude.ai/code/session_01ADbPGUdyPsY7vk4akKRjuX
</commit_message>
<xml_diff>
--- a/EDA_summary_report.docx
+++ b/EDA_summary_report.docx
@@ -220,7 +220,7 @@
             <w:pPr>
               <w:spacing w:after="0"/>
             </w:pPr>
-            <w:hyperlink w:history="1" r:id="rIdnrcih3ez7e0ovhevcqrmg">
+            <w:hyperlink w:history="1" r:id="rIdln9xccv6yaixizvzzcirt">
               <w:r>
                 <w:rPr>
                   <w:rStyle w:val="Hyperlink"/>
@@ -282,7 +282,7 @@
             <w:pPr>
               <w:spacing w:after="0"/>
             </w:pPr>
-            <w:hyperlink w:history="1" r:id="rIdftxu2gumu9gqmnw5hn4lu">
+            <w:hyperlink w:history="1" r:id="rId8rg5-mam5axiqhdaootlo">
               <w:r>
                 <w:rPr>
                   <w:rStyle w:val="Hyperlink"/>
@@ -557,7 +557,7 @@
         <w:spacing w:after="120"/>
       </w:pPr>
       <w:r>
-        <w:t xml:space="preserve">A higher GPA does mean a higher salary (r = 0.52). Even when comparing graduates of the same college with the same experience, each extra 0.1 GPA point is worth about $480 a year (p &lt; 0.001). But college matters far more. Together, all the columns explain 94% of salary differences, and college alone uniquely explains about 63%, experience about 3%, and GPA less than 1%. Field of study, gender and age explain nothing. Graduates with the same grades and experience can earn about $5,000 more or less depending on the college: Delaware graduates earn about $2,000 more than their profile predicts, and Rochester graduates about $3,300 less.</w:t>
+        <w:t xml:space="preserve">A higher GPA does mean a higher salary (r = 0.52). Even when comparing graduates of the same college with the same experience, each extra 0.1 GPA point is worth about $480 a year (p &lt; 0.001). But college matters far more. On its own, college explains 89% of salary differences. With every column in one model, 94% is explained, and about 63% is explained by college and by no other column, compared with about 3% for experience and less than 1% for GPA. Field of study, gender and age explain nothing. Graduates with the same grades and experience can earn about $5,000 more or less depending on the college: Delaware graduates earn about $2,000 more than their profile predicts, and Rochester graduates about $3,300 less.</w:t>
       </w:r>
     </w:p>
     <w:p>

</xml_diff>